<commit_message>
Wilson: Updated Phase 1 report (Custom Protocol Simulation and Analysis)
</commit_message>
<xml_diff>
--- a/Phase1_Research/Custom Protocol Simulation and Analysis.docx
+++ b/Phase1_Research/Custom Protocol Simulation and Analysis.docx
@@ -11,8 +11,19 @@
           <w:b/>
           <w:bCs/>
           <w:color w:val="000000" w:themeColor="text1"/>
-        </w:rPr>
-      </w:pPr>
+          <w:lang w:val="en-US"/>
+        </w:rPr>
+      </w:pPr>
+      <w:r>
+        <w:rPr>
+          <w:rFonts w:ascii="Times New Roman" w:hAnsi="Times New Roman" w:cs="Times New Roman"/>
+          <w:b/>
+          <w:bCs/>
+          <w:color w:val="000000" w:themeColor="text1"/>
+          <w:lang w:val="en-US"/>
+        </w:rPr>
+        <w:t>Custom Protocol Simulation Project</w:t>
+      </w:r>
     </w:p>
     <w:p>
       <w:pPr>
@@ -23,8 +34,19 @@
           <w:b/>
           <w:bCs/>
           <w:color w:val="000000" w:themeColor="text1"/>
-        </w:rPr>
-      </w:pPr>
+          <w:lang w:val="en-US"/>
+        </w:rPr>
+      </w:pPr>
+      <w:r>
+        <w:rPr>
+          <w:rFonts w:ascii="Times New Roman" w:hAnsi="Times New Roman" w:cs="Times New Roman"/>
+          <w:b/>
+          <w:bCs/>
+          <w:color w:val="000000" w:themeColor="text1"/>
+          <w:lang w:val="en-US"/>
+        </w:rPr>
+        <w:t>Capstone Project Report</w:t>
+      </w:r>
     </w:p>
     <w:p>
       <w:pPr>
@@ -35,8 +57,30 @@
           <w:b/>
           <w:bCs/>
           <w:color w:val="000000" w:themeColor="text1"/>
-        </w:rPr>
-      </w:pPr>
+          <w:lang w:val="en-US"/>
+        </w:rPr>
+      </w:pPr>
+      <w:r>
+        <w:rPr>
+          <w:rFonts w:ascii="Times New Roman" w:hAnsi="Times New Roman" w:cs="Times New Roman"/>
+          <w:b/>
+          <w:bCs/>
+          <w:color w:val="000000" w:themeColor="text1"/>
+          <w:lang w:val="en-US"/>
+        </w:rPr>
+        <w:t>Unit Code: CSG3101 - Applied Project</w:t>
+      </w:r>
+      <w:r>
+        <w:rPr>
+          <w:rFonts w:ascii="Times New Roman" w:hAnsi="Times New Roman" w:cs="Times New Roman"/>
+          <w:b/>
+          <w:bCs/>
+          <w:color w:val="000000" w:themeColor="text1"/>
+          <w:lang w:val="en-US"/>
+        </w:rPr>
+        <w:br/>
+        <w:t>Edith Cowan University</w:t>
+      </w:r>
     </w:p>
     <w:p>
       <w:pPr>
@@ -47,153 +91,16 @@
           <w:b/>
           <w:bCs/>
           <w:color w:val="000000" w:themeColor="text1"/>
-        </w:rPr>
-      </w:pPr>
-    </w:p>
-    <w:p>
-      <w:pPr>
-        <w:spacing w:line="360" w:lineRule="auto"/>
-        <w:jc w:val="center"/>
-        <w:rPr>
-          <w:rFonts w:ascii="Times New Roman" w:hAnsi="Times New Roman" w:cs="Times New Roman"/>
-          <w:b/>
-          <w:bCs/>
-          <w:color w:val="000000" w:themeColor="text1"/>
-        </w:rPr>
-      </w:pPr>
-      <w:r>
-        <w:rPr>
-          <w:rFonts w:ascii="Times New Roman" w:hAnsi="Times New Roman" w:cs="Times New Roman"/>
-          <w:b/>
-          <w:bCs/>
-          <w:color w:val="000000" w:themeColor="text1"/>
-        </w:rPr>
-        <w:t>Custom Protocol Simulation Project</w:t>
-      </w:r>
-    </w:p>
-    <w:p>
-      <w:pPr>
-        <w:spacing w:line="360" w:lineRule="auto"/>
-        <w:jc w:val="center"/>
-        <w:rPr>
-          <w:rFonts w:ascii="Times New Roman" w:hAnsi="Times New Roman" w:cs="Times New Roman"/>
-          <w:b/>
-          <w:bCs/>
-          <w:color w:val="000000" w:themeColor="text1"/>
-        </w:rPr>
-      </w:pPr>
-      <w:r>
-        <w:rPr>
-          <w:rFonts w:ascii="Times New Roman" w:hAnsi="Times New Roman" w:cs="Times New Roman"/>
-          <w:b/>
-          <w:bCs/>
-          <w:color w:val="000000" w:themeColor="text1"/>
-        </w:rPr>
-        <w:t>Capstone Project Report</w:t>
-      </w:r>
-    </w:p>
-    <w:p>
-      <w:pPr>
-        <w:spacing w:line="360" w:lineRule="auto"/>
-        <w:rPr>
-          <w:rFonts w:ascii="Times New Roman" w:hAnsi="Times New Roman" w:cs="Times New Roman"/>
-          <w:color w:val="000000" w:themeColor="text1"/>
-        </w:rPr>
-      </w:pPr>
-    </w:p>
-    <w:p>
-      <w:pPr>
-        <w:spacing w:line="360" w:lineRule="auto"/>
-        <w:rPr>
-          <w:rFonts w:ascii="Times New Roman" w:hAnsi="Times New Roman" w:cs="Times New Roman"/>
-          <w:color w:val="000000" w:themeColor="text1"/>
-        </w:rPr>
-      </w:pPr>
-    </w:p>
-    <w:p>
-      <w:pPr>
-        <w:spacing w:line="360" w:lineRule="auto"/>
-        <w:rPr>
-          <w:rFonts w:ascii="Times New Roman" w:hAnsi="Times New Roman" w:cs="Times New Roman"/>
-          <w:color w:val="000000" w:themeColor="text1"/>
-        </w:rPr>
-      </w:pPr>
-    </w:p>
-    <w:p>
-      <w:pPr>
-        <w:spacing w:line="360" w:lineRule="auto"/>
-        <w:rPr>
-          <w:rFonts w:ascii="Times New Roman" w:hAnsi="Times New Roman" w:cs="Times New Roman"/>
-          <w:color w:val="000000" w:themeColor="text1"/>
-        </w:rPr>
-      </w:pPr>
-    </w:p>
-    <w:p>
-      <w:pPr>
-        <w:spacing w:line="360" w:lineRule="auto"/>
-        <w:jc w:val="center"/>
-        <w:rPr>
-          <w:rFonts w:ascii="Times New Roman" w:hAnsi="Times New Roman" w:cs="Times New Roman"/>
-          <w:b/>
-          <w:bCs/>
-          <w:color w:val="000000" w:themeColor="text1"/>
-        </w:rPr>
-      </w:pPr>
-      <w:r>
-        <w:rPr>
-          <w:rFonts w:ascii="Times New Roman" w:hAnsi="Times New Roman" w:cs="Times New Roman"/>
-          <w:b/>
-          <w:bCs/>
-          <w:color w:val="000000" w:themeColor="text1"/>
-        </w:rPr>
-        <w:t xml:space="preserve">Unit Code: CSG3101 </w:t>
-      </w:r>
-      <w:r>
-        <w:rPr>
-          <w:rFonts w:ascii="Times New Roman" w:hAnsi="Times New Roman" w:cs="Times New Roman"/>
-          <w:b/>
-          <w:bCs/>
-          <w:color w:val="000000" w:themeColor="text1"/>
-        </w:rPr>
-        <w:t>-</w:t>
-      </w:r>
-      <w:r>
-        <w:rPr>
-          <w:rFonts w:ascii="Times New Roman" w:hAnsi="Times New Roman" w:cs="Times New Roman"/>
-          <w:b/>
-          <w:bCs/>
-          <w:color w:val="000000" w:themeColor="text1"/>
-        </w:rPr>
-        <w:t xml:space="preserve"> Applied Project</w:t>
-      </w:r>
-      <w:r>
-        <w:rPr>
-          <w:rFonts w:ascii="Times New Roman" w:hAnsi="Times New Roman" w:cs="Times New Roman"/>
-          <w:b/>
-          <w:bCs/>
-          <w:color w:val="000000" w:themeColor="text1"/>
-        </w:rPr>
-        <w:br/>
-        <w:t xml:space="preserve">Edith Cowan University </w:t>
-      </w:r>
-    </w:p>
-    <w:p>
-      <w:pPr>
-        <w:spacing w:line="360" w:lineRule="auto"/>
-        <w:jc w:val="center"/>
-        <w:rPr>
-          <w:rFonts w:ascii="Times New Roman" w:hAnsi="Times New Roman" w:cs="Times New Roman"/>
-          <w:b/>
-          <w:bCs/>
-          <w:color w:val="000000" w:themeColor="text1"/>
-        </w:rPr>
-      </w:pPr>
-      <w:r>
-        <w:rPr>
-          <w:rFonts w:ascii="Times New Roman" w:hAnsi="Times New Roman" w:cs="Times New Roman"/>
-          <w:b/>
-          <w:bCs/>
-          <w:color w:val="000000" w:themeColor="text1"/>
+          <w:lang w:val="en-US"/>
+        </w:rPr>
+      </w:pPr>
+      <w:r>
+        <w:rPr>
+          <w:rFonts w:ascii="Times New Roman" w:hAnsi="Times New Roman" w:cs="Times New Roman"/>
+          <w:b/>
+          <w:bCs/>
+          <w:color w:val="000000" w:themeColor="text1"/>
+          <w:lang w:val="en-US"/>
         </w:rPr>
         <w:t>Date: September 2025</w:t>
       </w:r>
@@ -206,85 +113,311 @@
           <w:b/>
           <w:bCs/>
           <w:color w:val="000000" w:themeColor="text1"/>
-        </w:rPr>
-      </w:pPr>
-    </w:p>
-    <w:p>
-      <w:pPr>
-        <w:spacing w:line="360" w:lineRule="auto"/>
-        <w:rPr>
-          <w:rFonts w:ascii="Times New Roman" w:hAnsi="Times New Roman" w:cs="Times New Roman"/>
-          <w:b/>
-          <w:bCs/>
-          <w:color w:val="000000" w:themeColor="text1"/>
-        </w:rPr>
-      </w:pPr>
-    </w:p>
-    <w:p>
-      <w:pPr>
-        <w:spacing w:line="360" w:lineRule="auto"/>
-        <w:rPr>
-          <w:rFonts w:ascii="Times New Roman" w:hAnsi="Times New Roman" w:cs="Times New Roman"/>
-          <w:b/>
-          <w:bCs/>
-          <w:color w:val="000000" w:themeColor="text1"/>
-        </w:rPr>
-      </w:pPr>
-    </w:p>
-    <w:p>
-      <w:pPr>
-        <w:spacing w:line="360" w:lineRule="auto"/>
-        <w:rPr>
-          <w:rFonts w:ascii="Times New Roman" w:hAnsi="Times New Roman" w:cs="Times New Roman"/>
-          <w:b/>
-          <w:bCs/>
-          <w:color w:val="000000" w:themeColor="text1"/>
-        </w:rPr>
-      </w:pPr>
-    </w:p>
-    <w:p>
-      <w:pPr>
-        <w:spacing w:line="360" w:lineRule="auto"/>
-        <w:rPr>
-          <w:rFonts w:ascii="Times New Roman" w:hAnsi="Times New Roman" w:cs="Times New Roman"/>
-          <w:b/>
-          <w:bCs/>
-          <w:color w:val="000000" w:themeColor="text1"/>
-        </w:rPr>
-      </w:pPr>
-    </w:p>
-    <w:p>
-      <w:pPr>
-        <w:spacing w:line="360" w:lineRule="auto"/>
-        <w:rPr>
-          <w:rFonts w:ascii="Times New Roman" w:hAnsi="Times New Roman" w:cs="Times New Roman"/>
-          <w:b/>
-          <w:bCs/>
-          <w:color w:val="000000" w:themeColor="text1"/>
-        </w:rPr>
-      </w:pPr>
-    </w:p>
-    <w:p>
-      <w:pPr>
-        <w:spacing w:line="360" w:lineRule="auto"/>
-        <w:rPr>
-          <w:rFonts w:ascii="Times New Roman" w:hAnsi="Times New Roman" w:cs="Times New Roman"/>
-          <w:b/>
-          <w:bCs/>
-          <w:color w:val="000000" w:themeColor="text1"/>
-        </w:rPr>
-      </w:pPr>
-    </w:p>
-    <w:p>
-      <w:pPr>
-        <w:spacing w:line="360" w:lineRule="auto"/>
-        <w:rPr>
-          <w:rFonts w:ascii="Times New Roman" w:hAnsi="Times New Roman" w:cs="Times New Roman"/>
-          <w:b/>
-          <w:bCs/>
-          <w:color w:val="000000" w:themeColor="text1"/>
-        </w:rPr>
-      </w:pPr>
+          <w:lang w:val="en-US"/>
+        </w:rPr>
+      </w:pPr>
+    </w:p>
+    <w:p>
+      <w:pPr>
+        <w:spacing w:line="360" w:lineRule="auto"/>
+        <w:rPr>
+          <w:rFonts w:ascii="Times New Roman" w:hAnsi="Times New Roman" w:cs="Times New Roman"/>
+          <w:b/>
+          <w:bCs/>
+          <w:color w:val="000000" w:themeColor="text1"/>
+          <w:u w:val="single"/>
+          <w:lang w:val="en-US"/>
+        </w:rPr>
+      </w:pPr>
+      <w:r>
+        <w:rPr>
+          <w:rFonts w:ascii="Times New Roman" w:hAnsi="Times New Roman" w:cs="Times New Roman"/>
+          <w:b/>
+          <w:bCs/>
+          <w:color w:val="000000" w:themeColor="text1"/>
+          <w:u w:val="single"/>
+          <w:lang w:val="en-US"/>
+        </w:rPr>
+        <w:t>GROUP MEMBERS</w:t>
+      </w:r>
+    </w:p>
+    <w:p>
+      <w:pPr>
+        <w:spacing w:line="360" w:lineRule="auto"/>
+        <w:rPr>
+          <w:rFonts w:ascii="Times New Roman" w:hAnsi="Times New Roman" w:cs="Times New Roman"/>
+          <w:b/>
+          <w:bCs/>
+          <w:color w:val="000000" w:themeColor="text1"/>
+          <w:lang w:val="en-US"/>
+        </w:rPr>
+      </w:pPr>
+      <w:r>
+        <w:rPr>
+          <w:rFonts w:ascii="Times New Roman" w:hAnsi="Times New Roman" w:cs="Times New Roman"/>
+          <w:b/>
+          <w:bCs/>
+          <w:color w:val="000000" w:themeColor="text1"/>
+          <w:lang w:val="en-US"/>
+        </w:rPr>
+        <w:t>STUDENT NAME: PHILLIP MWANGUKU</w:t>
+      </w:r>
+    </w:p>
+    <w:p>
+      <w:pPr>
+        <w:spacing w:line="360" w:lineRule="auto"/>
+        <w:rPr>
+          <w:rFonts w:ascii="Times New Roman" w:hAnsi="Times New Roman" w:cs="Times New Roman"/>
+          <w:b/>
+          <w:bCs/>
+          <w:color w:val="000000" w:themeColor="text1"/>
+          <w:lang w:val="en-US"/>
+        </w:rPr>
+      </w:pPr>
+      <w:r>
+        <w:rPr>
+          <w:rFonts w:ascii="Times New Roman" w:hAnsi="Times New Roman" w:cs="Times New Roman"/>
+          <w:b/>
+          <w:bCs/>
+          <w:color w:val="000000" w:themeColor="text1"/>
+          <w:lang w:val="en-US"/>
+        </w:rPr>
+        <w:t>STUDENT ID: 10619172</w:t>
+      </w:r>
+    </w:p>
+    <w:p>
+      <w:pPr>
+        <w:spacing w:line="360" w:lineRule="auto"/>
+        <w:rPr>
+          <w:rFonts w:ascii="Times New Roman" w:hAnsi="Times New Roman" w:cs="Times New Roman"/>
+          <w:b/>
+          <w:bCs/>
+          <w:color w:val="000000" w:themeColor="text1"/>
+          <w:lang w:val="en-US"/>
+        </w:rPr>
+      </w:pPr>
+    </w:p>
+    <w:p>
+      <w:pPr>
+        <w:spacing w:line="360" w:lineRule="auto"/>
+        <w:rPr>
+          <w:rFonts w:ascii="Times New Roman" w:hAnsi="Times New Roman" w:cs="Times New Roman"/>
+          <w:b/>
+          <w:bCs/>
+          <w:color w:val="000000" w:themeColor="text1"/>
+          <w:lang w:val="en-US"/>
+        </w:rPr>
+      </w:pPr>
+      <w:r>
+        <w:rPr>
+          <w:rFonts w:ascii="Times New Roman" w:hAnsi="Times New Roman" w:cs="Times New Roman"/>
+          <w:b/>
+          <w:bCs/>
+          <w:color w:val="000000" w:themeColor="text1"/>
+          <w:lang w:val="en-US"/>
+        </w:rPr>
+        <w:t>STUDENT NAME: CHILUFYA JOSEPH KAWIMBE</w:t>
+      </w:r>
+    </w:p>
+    <w:p>
+      <w:pPr>
+        <w:spacing w:line="360" w:lineRule="auto"/>
+        <w:rPr>
+          <w:rFonts w:ascii="Times New Roman" w:hAnsi="Times New Roman" w:cs="Times New Roman"/>
+          <w:b/>
+          <w:bCs/>
+          <w:color w:val="000000" w:themeColor="text1"/>
+          <w:lang w:val="en-US"/>
+        </w:rPr>
+      </w:pPr>
+      <w:r>
+        <w:rPr>
+          <w:rFonts w:ascii="Times New Roman" w:hAnsi="Times New Roman" w:cs="Times New Roman"/>
+          <w:b/>
+          <w:bCs/>
+          <w:color w:val="000000" w:themeColor="text1"/>
+          <w:lang w:val="en-US"/>
+        </w:rPr>
+        <w:t xml:space="preserve">STUDENT ID: 10620355 </w:t>
+      </w:r>
+    </w:p>
+    <w:p>
+      <w:pPr>
+        <w:spacing w:line="360" w:lineRule="auto"/>
+        <w:rPr>
+          <w:rFonts w:ascii="Times New Roman" w:hAnsi="Times New Roman" w:cs="Times New Roman"/>
+          <w:b/>
+          <w:bCs/>
+          <w:color w:val="000000" w:themeColor="text1"/>
+          <w:lang w:val="en-US"/>
+        </w:rPr>
+      </w:pPr>
+    </w:p>
+    <w:p>
+      <w:pPr>
+        <w:spacing w:line="360" w:lineRule="auto"/>
+        <w:rPr>
+          <w:rFonts w:ascii="Times New Roman" w:hAnsi="Times New Roman" w:cs="Times New Roman"/>
+          <w:b/>
+          <w:bCs/>
+          <w:color w:val="000000" w:themeColor="text1"/>
+          <w:lang w:val="en-US"/>
+        </w:rPr>
+      </w:pPr>
+      <w:r>
+        <w:rPr>
+          <w:rFonts w:ascii="Times New Roman" w:hAnsi="Times New Roman" w:cs="Times New Roman"/>
+          <w:b/>
+          <w:bCs/>
+          <w:color w:val="000000" w:themeColor="text1"/>
+          <w:lang w:val="en-US"/>
+        </w:rPr>
+        <w:t>STUDENT NAME: WILSON MUGWE GATHII</w:t>
+      </w:r>
+    </w:p>
+    <w:p>
+      <w:pPr>
+        <w:spacing w:line="360" w:lineRule="auto"/>
+        <w:rPr>
+          <w:rFonts w:ascii="Times New Roman" w:hAnsi="Times New Roman" w:cs="Times New Roman"/>
+          <w:b/>
+          <w:bCs/>
+          <w:color w:val="000000" w:themeColor="text1"/>
+          <w:lang w:val="en-US"/>
+        </w:rPr>
+      </w:pPr>
+      <w:r>
+        <w:rPr>
+          <w:rFonts w:ascii="Times New Roman" w:hAnsi="Times New Roman" w:cs="Times New Roman"/>
+          <w:b/>
+          <w:bCs/>
+          <w:color w:val="000000" w:themeColor="text1"/>
+          <w:lang w:val="en-US"/>
+        </w:rPr>
+        <w:t>STUDENT ID: 10641382</w:t>
+      </w:r>
+    </w:p>
+    <w:p>
+      <w:pPr>
+        <w:spacing w:line="360" w:lineRule="auto"/>
+        <w:rPr>
+          <w:rFonts w:ascii="Times New Roman" w:hAnsi="Times New Roman" w:cs="Times New Roman"/>
+          <w:b/>
+          <w:bCs/>
+          <w:color w:val="000000" w:themeColor="text1"/>
+          <w:lang w:val="en-US"/>
+        </w:rPr>
+      </w:pPr>
+    </w:p>
+    <w:p>
+      <w:pPr>
+        <w:spacing w:line="360" w:lineRule="auto"/>
+        <w:rPr>
+          <w:rFonts w:ascii="Times New Roman" w:hAnsi="Times New Roman" w:cs="Times New Roman"/>
+          <w:b/>
+          <w:bCs/>
+          <w:color w:val="000000" w:themeColor="text1"/>
+          <w:lang w:val="en-US"/>
+        </w:rPr>
+      </w:pPr>
+      <w:r>
+        <w:rPr>
+          <w:rFonts w:ascii="Times New Roman" w:hAnsi="Times New Roman" w:cs="Times New Roman"/>
+          <w:b/>
+          <w:bCs/>
+          <w:color w:val="000000" w:themeColor="text1"/>
+          <w:lang w:val="en-US"/>
+        </w:rPr>
+        <w:t>STUDENT NAME: DIPESH NEPAL</w:t>
+      </w:r>
+      <w:r>
+        <w:rPr>
+          <w:rFonts w:ascii="Times New Roman" w:hAnsi="Times New Roman" w:cs="Times New Roman"/>
+          <w:b/>
+          <w:bCs/>
+          <w:color w:val="000000" w:themeColor="text1"/>
+          <w:lang w:val="en-US"/>
+        </w:rPr>
+        <w:tab/>
+      </w:r>
+    </w:p>
+    <w:p>
+      <w:pPr>
+        <w:spacing w:line="360" w:lineRule="auto"/>
+        <w:rPr>
+          <w:rFonts w:ascii="Times New Roman" w:hAnsi="Times New Roman" w:cs="Times New Roman"/>
+          <w:b/>
+          <w:bCs/>
+          <w:color w:val="000000" w:themeColor="text1"/>
+          <w:lang w:val="en-US"/>
+        </w:rPr>
+      </w:pPr>
+      <w:r>
+        <w:rPr>
+          <w:rFonts w:ascii="Times New Roman" w:hAnsi="Times New Roman" w:cs="Times New Roman"/>
+          <w:b/>
+          <w:bCs/>
+          <w:color w:val="000000" w:themeColor="text1"/>
+          <w:lang w:val="en-US"/>
+        </w:rPr>
+        <w:t>STUDENT ID: 10643078</w:t>
+      </w:r>
+    </w:p>
+    <w:p>
+      <w:pPr>
+        <w:spacing w:line="360" w:lineRule="auto"/>
+        <w:rPr>
+          <w:rFonts w:ascii="Times New Roman" w:hAnsi="Times New Roman" w:cs="Times New Roman"/>
+          <w:b/>
+          <w:bCs/>
+          <w:color w:val="000000" w:themeColor="text1"/>
+          <w:lang w:val="en-US"/>
+        </w:rPr>
+      </w:pPr>
+    </w:p>
+    <w:p>
+      <w:pPr>
+        <w:spacing w:line="360" w:lineRule="auto"/>
+        <w:rPr>
+          <w:rFonts w:ascii="Times New Roman" w:hAnsi="Times New Roman" w:cs="Times New Roman"/>
+          <w:b/>
+          <w:bCs/>
+          <w:color w:val="000000" w:themeColor="text1"/>
+          <w:lang w:val="en-US"/>
+        </w:rPr>
+      </w:pPr>
+      <w:r>
+        <w:rPr>
+          <w:rFonts w:ascii="Times New Roman" w:hAnsi="Times New Roman" w:cs="Times New Roman"/>
+          <w:b/>
+          <w:bCs/>
+          <w:color w:val="000000" w:themeColor="text1"/>
+          <w:lang w:val="en-US"/>
+        </w:rPr>
+        <w:t xml:space="preserve">STUDENT NAME: NAYARA ROCHELLE BAMUNUGE PERERA </w:t>
+      </w:r>
+    </w:p>
+    <w:p>
+      <w:pPr>
+        <w:spacing w:line="360" w:lineRule="auto"/>
+        <w:rPr>
+          <w:rFonts w:ascii="Times New Roman" w:hAnsi="Times New Roman" w:cs="Times New Roman"/>
+          <w:b/>
+          <w:bCs/>
+          <w:color w:val="000000" w:themeColor="text1"/>
+          <w:lang w:val="en-US"/>
+        </w:rPr>
+      </w:pPr>
+      <w:r>
+        <w:rPr>
+          <w:rFonts w:ascii="Times New Roman" w:hAnsi="Times New Roman" w:cs="Times New Roman"/>
+          <w:b/>
+          <w:bCs/>
+          <w:color w:val="000000" w:themeColor="text1"/>
+          <w:lang w:val="en-US"/>
+        </w:rPr>
+        <w:t>STUDENT ID: 10662685</w:t>
+      </w:r>
     </w:p>
     <w:p>
       <w:pPr>
@@ -333,9 +466,13 @@
     <w:sdt>
       <w:sdtPr>
         <w:rPr>
-          <w:rFonts w:ascii="Times New Roman" w:hAnsi="Times New Roman" w:cs="Times New Roman"/>
+          <w:rFonts w:ascii="Times New Roman" w:eastAsiaTheme="minorHAnsi" w:hAnsi="Times New Roman" w:cs="Times New Roman"/>
+          <w:color w:val="auto"/>
+          <w:kern w:val="2"/>
           <w:sz w:val="24"/>
           <w:szCs w:val="24"/>
+          <w:lang w:val="en-AU"/>
+          <w14:ligatures w14:val="standardContextual"/>
         </w:rPr>
         <w:id w:val="847457618"/>
         <w:docPartObj>
@@ -345,14 +482,9 @@
       </w:sdtPr>
       <w:sdtEndPr>
         <w:rPr>
-          <w:rFonts w:eastAsiaTheme="minorHAnsi"/>
           <w:b/>
           <w:bCs/>
           <w:noProof/>
-          <w:color w:val="auto"/>
-          <w:kern w:val="2"/>
-          <w:lang w:val="en-AU"/>
-          <w14:ligatures w14:val="standardContextual"/>
         </w:rPr>
       </w:sdtEndPr>
       <w:sdtContent>
@@ -5324,17 +5456,8 @@
           <w:rFonts w:ascii="Times New Roman" w:hAnsi="Times New Roman" w:cs="Times New Roman"/>
           <w:color w:val="000000" w:themeColor="text1"/>
         </w:rPr>
-        <w:t xml:space="preserve"> and validated in Wireshark, making theory observable in practice.</w:t>
-      </w:r>
-    </w:p>
-    <w:p>
-      <w:pPr>
-        <w:spacing w:line="360" w:lineRule="auto"/>
-        <w:rPr>
-          <w:rFonts w:ascii="Times New Roman" w:hAnsi="Times New Roman" w:cs="Times New Roman"/>
-          <w:color w:val="000000" w:themeColor="text1"/>
-        </w:rPr>
-      </w:pPr>
+        <w:t xml:space="preserve"> and validated in Wireshark, making theory observable in practice</w:t>
+      </w:r>
     </w:p>
     <w:p>
       <w:pPr>
@@ -5485,21 +5608,12 @@
           <w:color w:val="000000" w:themeColor="text1"/>
         </w:rPr>
       </w:pPr>
-      <w:proofErr w:type="spellStart"/>
-      <w:r>
-        <w:rPr>
-          <w:rFonts w:ascii="Times New Roman" w:hAnsi="Times New Roman" w:cs="Times New Roman"/>
-          <w:color w:val="000000" w:themeColor="text1"/>
-        </w:rPr>
-        <w:t>Ellsberger</w:t>
-      </w:r>
-      <w:proofErr w:type="spellEnd"/>
-      <w:r>
-        <w:rPr>
-          <w:rFonts w:ascii="Times New Roman" w:hAnsi="Times New Roman" w:cs="Times New Roman"/>
-          <w:color w:val="000000" w:themeColor="text1"/>
-        </w:rPr>
-        <w:t xml:space="preserve">, J., Hogrefe, D., &amp; Sarma, A. (1997). </w:t>
+      <w:r>
+        <w:rPr>
+          <w:rFonts w:ascii="Times New Roman" w:hAnsi="Times New Roman" w:cs="Times New Roman"/>
+          <w:color w:val="000000" w:themeColor="text1"/>
+        </w:rPr>
+        <w:t xml:space="preserve">Ellsberger, J., Hogrefe, D., &amp; Sarma, A. (1997). </w:t>
       </w:r>
       <w:r>
         <w:rPr>

</xml_diff>